<commit_message>
Temperature, Time-range and field pig
Changed temperature to 20 cm above ground for field cattle

Changed algorithm to determine common time-range, as the former "falied" when applied to pig slurry

Produced accumulated emissions for pig slurry
</commit_message>
<xml_diff>
--- a/Lab-trails/2026-01-06-cattle-slurry/2026-01-06-lab-cattle-slurry-overview.docx
+++ b/Lab-trails/2026-01-06-cattle-slurry/2026-01-06-lab-cattle-slurry-overview.docx
@@ -134,13 +134,8 @@
     </w:p>
     <w:p>
       <w:r>
-        <w:t>Ie. Sample in container 18 will be described as 18.</w:t>
-      </w:r>
-      <w:proofErr w:type="gramStart"/>
-      <w:r>
-        <w:t>F.AA</w:t>
-      </w:r>
-      <w:proofErr w:type="gramEnd"/>
+        <w:t>Ie. Sample in container 18 will be described as 18.F.AA</w:t>
+      </w:r>
     </w:p>
     <w:p>
       <w:pPr>
@@ -457,21 +452,8 @@
           <w:bCs/>
         </w:rPr>
       </w:pPr>
-      <w:proofErr w:type="spellStart"/>
-      <w:r>
-        <w:t>Reol</w:t>
-      </w:r>
-      <w:proofErr w:type="spellEnd"/>
-      <w:r>
-        <w:t xml:space="preserve"> 8 </w:t>
-      </w:r>
-      <w:proofErr w:type="spellStart"/>
-      <w:r>
-        <w:t>kasse</w:t>
-      </w:r>
-      <w:proofErr w:type="spellEnd"/>
-      <w:r>
-        <w:t xml:space="preserve"> 139</w:t>
+      <w:r>
+        <w:t>Reol 8 kasse 139</w:t>
       </w:r>
     </w:p>
     <w:p>
@@ -502,23 +484,7 @@
           <w:b/>
           <w:bCs/>
         </w:rPr>
-        <w:t xml:space="preserve">Test </w:t>
-      </w:r>
-      <w:proofErr w:type="gramStart"/>
-      <w:r>
-        <w:rPr>
-          <w:b/>
-          <w:bCs/>
-        </w:rPr>
-        <w:t>of</w:t>
-      </w:r>
-      <w:proofErr w:type="gramEnd"/>
-      <w:r>
-        <w:rPr>
-          <w:b/>
-          <w:bCs/>
-        </w:rPr>
-        <w:t xml:space="preserve"> F-soil water content</w:t>
+        <w:t>Test of F-soil water content</w:t>
       </w:r>
     </w:p>
     <w:p>
@@ -631,15 +597,7 @@
       </w:pPr>
       <w:r>
         <w:lastRenderedPageBreak/>
-        <w:t xml:space="preserve">9 </w:t>
-      </w:r>
-      <w:proofErr w:type="gramStart"/>
-      <w:r>
-        <w:t>small,</w:t>
-      </w:r>
-      <w:proofErr w:type="gramEnd"/>
-      <w:r>
-        <w:t xml:space="preserve"> tests on the day</w:t>
+        <w:t>9 small, tests on the day</w:t>
       </w:r>
     </w:p>
     <w:p/>
@@ -748,6 +706,9 @@
       <w:r>
         <w:rPr>
           <w:rStyle w:val="CommentReference"/>
+          <w:sz w:val="24"/>
+          <w:szCs w:val="24"/>
+          <w:highlight w:val="yellow"/>
         </w:rPr>
         <w:commentReference w:id="0"/>
       </w:r>
@@ -827,40 +788,15 @@
           <w:rFonts w:eastAsiaTheme="minorEastAsia"/>
           <w:iCs/>
         </w:rPr>
-        <w:t xml:space="preserve"> </w:t>
-      </w:r>
-      <w:proofErr w:type="gramStart"/>
+        <w:t xml:space="preserve"> each time, wait for 1 minute and measure pH, until similar</w:t>
+      </w:r>
       <w:r>
         <w:rPr>
           <w:rFonts w:eastAsiaTheme="minorEastAsia"/>
           <w:iCs/>
         </w:rPr>
-        <w:t>each</w:t>
-      </w:r>
-      <w:proofErr w:type="gramEnd"/>
-      <w:r>
-        <w:rPr>
-          <w:rFonts w:eastAsiaTheme="minorEastAsia"/>
-          <w:iCs/>
-        </w:rPr>
-        <w:t xml:space="preserve"> time, wait for 1 minute and measure pH, until </w:t>
-      </w:r>
-      <w:proofErr w:type="gramStart"/>
-      <w:r>
-        <w:rPr>
-          <w:rFonts w:eastAsiaTheme="minorEastAsia"/>
-          <w:iCs/>
-        </w:rPr>
-        <w:t>similar</w:t>
-      </w:r>
-      <w:r>
-        <w:rPr>
-          <w:rFonts w:eastAsiaTheme="minorEastAsia"/>
-          <w:iCs/>
-        </w:rPr>
         <w:t xml:space="preserve"> to</w:t>
       </w:r>
-      <w:proofErr w:type="gramEnd"/>
       <w:r>
         <w:rPr>
           <w:rFonts w:eastAsiaTheme="minorEastAsia"/>
@@ -954,7 +890,6 @@
           <m:t>·</m:t>
         </m:r>
       </m:oMath>
-      <w:proofErr w:type="gramStart"/>
       <w:r>
         <w:rPr>
           <w:rFonts w:eastAsiaTheme="minorEastAsia"/>
@@ -967,27 +902,27 @@
           <w:rFonts w:eastAsiaTheme="minorEastAsia"/>
           <w:iCs/>
         </w:rPr>
-        <w:t xml:space="preserve">  of</w:t>
-      </w:r>
-      <w:proofErr w:type="gramEnd"/>
-      <w:r>
-        <w:rPr>
+        <w:t xml:space="preserve">  of each for long-term storage</w:t>
+      </w:r>
+      <w:commentRangeEnd w:id="1"/>
+      <w:r>
+        <w:rPr>
+          <w:rStyle w:val="CommentReference"/>
           <w:rFonts w:eastAsiaTheme="minorEastAsia"/>
           <w:iCs/>
-        </w:rPr>
-        <w:t xml:space="preserve"> each for long-term storage</w:t>
-      </w:r>
-      <w:commentRangeEnd w:id="1"/>
+          <w:sz w:val="24"/>
+          <w:szCs w:val="24"/>
+        </w:rPr>
+        <w:commentReference w:id="1"/>
+      </w:r>
+      <w:commentRangeEnd w:id="2"/>
       <w:r>
         <w:rPr>
           <w:rStyle w:val="CommentReference"/>
-        </w:rPr>
-        <w:commentReference w:id="1"/>
-      </w:r>
-      <w:commentRangeEnd w:id="2"/>
-      <w:r>
-        <w:rPr>
-          <w:rStyle w:val="CommentReference"/>
+          <w:rFonts w:eastAsiaTheme="minorEastAsia"/>
+          <w:iCs/>
+          <w:sz w:val="24"/>
+          <w:szCs w:val="24"/>
         </w:rPr>
         <w:commentReference w:id="2"/>
       </w:r>
@@ -1127,6 +1062,8 @@
       <w:r>
         <w:rPr>
           <w:rStyle w:val="CommentReference"/>
+          <w:sz w:val="24"/>
+          <w:szCs w:val="24"/>
         </w:rPr>
         <w:commentReference w:id="3"/>
       </w:r>
@@ -1440,14 +1377,7 @@
         <w:rPr>
           <w:rFonts w:eastAsiaTheme="minorEastAsia"/>
         </w:rPr>
-        <w:t>Measure exact nitrogen content [</w:t>
-      </w:r>
-      <w:proofErr w:type="spellStart"/>
-      <w:r>
-        <w:rPr>
-          <w:rFonts w:eastAsiaTheme="minorEastAsia"/>
-        </w:rPr>
-        <w:t>g</w:t>
+        <w:t>Measure exact nitrogen content [g</w:t>
       </w:r>
       <w:r>
         <w:rPr>
@@ -1456,7 +1386,6 @@
         </w:rPr>
         <w:t>N</w:t>
       </w:r>
-      <w:proofErr w:type="spellEnd"/>
       <w:r>
         <w:rPr>
           <w:rFonts w:eastAsiaTheme="minorEastAsia"/>
@@ -1509,15 +1438,7 @@
         </w:numPr>
       </w:pPr>
       <w:r>
-        <w:t xml:space="preserve">Set up </w:t>
-      </w:r>
-      <w:proofErr w:type="gramStart"/>
-      <w:r>
-        <w:t>valve</w:t>
-      </w:r>
-      <w:proofErr w:type="gramEnd"/>
-      <w:r>
-        <w:t>-cycles and test the changes.</w:t>
+        <w:t>Set up valve-cycles and test the changes.</w:t>
       </w:r>
     </w:p>
     <w:p>
@@ -1529,13 +1450,8 @@
         </w:numPr>
       </w:pPr>
       <w:r>
-        <w:t xml:space="preserve">Change Any Desk password to </w:t>
-      </w:r>
-      <w:proofErr w:type="spellStart"/>
-      <w:r>
-        <w:t>windtunnel</w:t>
-      </w:r>
-      <w:proofErr w:type="spellEnd"/>
+        <w:t>Change Any Desk password to windtunnel</w:t>
+      </w:r>
     </w:p>
     <w:p>
       <w:pPr>
@@ -1756,6 +1672,8 @@
       <w:r>
         <w:rPr>
           <w:rStyle w:val="CommentReference"/>
+          <w:sz w:val="24"/>
+          <w:szCs w:val="24"/>
         </w:rPr>
         <w:commentReference w:id="4"/>
       </w:r>
@@ -3484,34 +3402,7 @@
             <w:rPr>
               <w:rFonts w:ascii="Cambria Math" w:eastAsiaTheme="minorEastAsia" w:hAnsi="Cambria Math"/>
             </w:rPr>
-            <m:t>=37.5</m:t>
-          </m:r>
-          <m:r>
-            <m:rPr>
-              <m:sty m:val="p"/>
-            </m:rPr>
-            <w:rPr>
-              <w:rFonts w:ascii="Cambria Math" w:eastAsiaTheme="minorEastAsia" w:hAnsi="Cambria Math"/>
-            </w:rPr>
-            <m:t xml:space="preserve"> g </m:t>
-          </m:r>
-          <m:r>
-            <m:rPr>
-              <m:sty m:val="p"/>
-            </m:rPr>
-            <w:rPr>
-              <w:rFonts w:ascii="Cambria Math" w:eastAsiaTheme="minorEastAsia" w:hAnsi="Cambria Math"/>
-            </w:rPr>
-            <m:t>±2.25</m:t>
-          </m:r>
-          <m:r>
-            <m:rPr>
-              <m:sty m:val="p"/>
-            </m:rPr>
-            <w:rPr>
-              <w:rFonts w:ascii="Cambria Math" w:eastAsiaTheme="minorEastAsia" w:hAnsi="Cambria Math"/>
-            </w:rPr>
-            <m:t xml:space="preserve"> g</m:t>
+            <m:t>=37.5 g ±2.25 g</m:t>
           </m:r>
         </m:oMath>
       </m:oMathPara>
@@ -5781,25 +5672,7 @@
             <w:rPr>
               <w:rFonts w:ascii="Cambria Math" w:hAnsi="Cambria Math"/>
             </w:rPr>
-            <m:t>=1.8</m:t>
-          </m:r>
-          <m:r>
-            <m:rPr>
-              <m:sty m:val="p"/>
-            </m:rPr>
-            <w:rPr>
-              <w:rFonts w:ascii="Cambria Math" w:hAnsi="Cambria Math"/>
-            </w:rPr>
-            <m:t>4</m:t>
-          </m:r>
-          <m:r>
-            <m:rPr>
-              <m:sty m:val="p"/>
-            </m:rPr>
-            <w:rPr>
-              <w:rFonts w:ascii="Cambria Math" w:hAnsi="Cambria Math"/>
-            </w:rPr>
-            <m:t xml:space="preserve"> g m</m:t>
+            <m:t>=1.84 g m</m:t>
           </m:r>
           <m:sSup>
             <m:sSupPr>
@@ -5897,25 +5770,7 @@
             <w:rPr>
               <w:rFonts w:ascii="Cambria Math" w:hAnsi="Cambria Math"/>
             </w:rPr>
-            <m:t>=188</m:t>
-          </m:r>
-          <m:r>
-            <m:rPr>
-              <m:sty m:val="p"/>
-            </m:rPr>
-            <w:rPr>
-              <w:rFonts w:ascii="Cambria Math" w:hAnsi="Cambria Math"/>
-            </w:rPr>
-            <m:t>4</m:t>
-          </m:r>
-          <m:r>
-            <m:rPr>
-              <m:sty m:val="p"/>
-            </m:rPr>
-            <w:rPr>
-              <w:rFonts w:ascii="Cambria Math" w:hAnsi="Cambria Math"/>
-            </w:rPr>
-            <m:t xml:space="preserve"> g</m:t>
+            <m:t>=1884 g</m:t>
           </m:r>
         </m:oMath>
       </m:oMathPara>
@@ -5969,16 +5824,7 @@
             <w:rPr>
               <w:rFonts w:ascii="Cambria Math" w:hAnsi="Cambria Math"/>
             </w:rPr>
-            <m:t>=1884 g·0.96</m:t>
-          </m:r>
-          <m:r>
-            <m:rPr>
-              <m:sty m:val="p"/>
-            </m:rPr>
-            <w:rPr>
-              <w:rFonts w:ascii="Cambria Math" w:hAnsi="Cambria Math"/>
-            </w:rPr>
-            <m:t>=1808.64·g</m:t>
+            <m:t>=1884 g·0.96=1808.64·g</m:t>
           </m:r>
         </m:oMath>
       </m:oMathPara>

</xml_diff>